<commit_message>
Final review: complete term index for every chapter, see-lines, missing key glossary terms
- Term index: Ch 24-27 now list every named organism or example, as Ch 23 did (cocklebur, clover,
  Jatropha, celery, mangrove, grapes, ...), and every glossary term that appears on a slide has its
  own entry. Key topics added where they were missing (osmosis, receptors, flowers, leaves, stems,
  adaptations to land, ...).
- The builder writes "see" lines for the other terms in an entry's name ("Petiole see Blade,
  petiole") and fails if a glossary term on a slide only says "see Glossary".
- Glossary: bryophyte, pteridophyte and gymnosperm group lists (Ch 23); ground and vascular tissue
  (Ch 24); biological clock (Ch 26); ovary / ovule, pollen tube, polar nuclei (Ch 27).
- The index's first-page header names the contents.

Co-Authored-By: Claude Opus 5.5 <noreply@anthropic.com>
Claude-Session: https://claude.ai/code/session_01UCsH9gqSSaKQv3czcDCA1B
</commit_message>
<xml_diff>
--- a/Printed Exam Notes/Ch 23 Index.docx
+++ b/Printed Exam Notes/Ch 23 Index.docx
@@ -28,8 +28,14 @@
         <w:pStyle w:val="Mapsection"/>
       </w:pPr>
       <w:r>
-        <w:rPr/>
-        <w:t>Contents (pages in the main notes)</w:t>
+        <w:rPr>
+          <w:rStyle w:val="Slidecode"/>
+        </w:rPr>
+        <w:t>Contents</w:t>
+      </w:r>
+      <w:r>
+        <w:rPr/>
+        <w:t xml:space="preserve"> (pages in the main notes)</w:t>
       </w:r>
     </w:p>
     <w:p>
@@ -2999,6 +3005,21 @@
         <w:rPr>
           <w:b/>
         </w:rPr>
+        <w:t>Conifers / cycads / ginkgoes / gnetophytes</w:t>
+      </w:r>
+      <w:r>
+        <w:rPr/>
+        <w:t>: the four gymnosperm groups: needle-like leaves, monoecious (pines) / palm- or fern-like, pollen and seed cones on separate plants / one surviving species, dioecious / no archegonia (Gnetum, Ephedra, Welwitschia) 23.5.57</w:t>
+      </w:r>
+    </w:p>
+    <w:p>
+      <w:pPr>
+        <w:pStyle w:val="Entry"/>
+      </w:pPr>
+      <w:r>
+        <w:rPr>
+          <w:b/>
+        </w:rPr>
         <w:t>Cotyledon</w:t>
       </w:r>
       <w:r>
@@ -3149,6 +3170,21 @@
         <w:rPr>
           <w:b/>
         </w:rPr>
+        <w:t>Ferns / horsetails / whisk ferns</w:t>
+      </w:r>
+      <w:r>
+        <w:rPr/>
+        <w:t>: the pteridophytes: fronds with sori / Equisetum, small leaves in whorls, silica / Psilotum, no leaves, forking stems 23.4.36</w:t>
+      </w:r>
+    </w:p>
+    <w:p>
+      <w:pPr>
+        <w:pStyle w:val="Entry"/>
+      </w:pPr>
+      <w:r>
+        <w:rPr>
+          <w:b/>
+        </w:rPr>
         <w:t>Fitness</w:t>
       </w:r>
       <w:r>
@@ -3344,6 +3380,21 @@
         <w:rPr>
           <w:b/>
         </w:rPr>
+        <w:t>Liverworts / hornworts / mosses</w:t>
+      </w:r>
+      <w:r>
+        <w:rPr/>
+        <w:t>: the three bryophyte groups: flat thallus or leafy shoots, gemmae / horn-shaped sporophytes, cyanobacteria partners / the largest group, protonema, sporophyte attached to the gametophyte 23.1.4</w:t>
+      </w:r>
+    </w:p>
+    <w:p>
+      <w:pPr>
+        <w:pStyle w:val="Entry"/>
+      </w:pPr>
+      <w:r>
+        <w:rPr>
+          <w:b/>
+        </w:rPr>
         <w:t>Lycophytes</w:t>
       </w:r>
       <w:r>
@@ -3854,7 +3905,7 @@
         <w:rPr>
           <w:b/>
         </w:rPr>
-        <w:t>True roots, stems and leaves</w:t>
+        <w:t>True roots (and stems, leaves)</w:t>
       </w:r>
       <w:r>
         <w:rPr/>
@@ -3972,6 +4023,21 @@
         <w:rPr>
           <w:b/>
         </w:rPr>
+        <w:t>Adaptations to land</w:t>
+      </w:r>
+      <w:r>
+        <w:rPr/>
+        <w:t xml:space="preserve"> 23.1.9 (problems, solutions), 23.1.14 (sporophyte dominance), 23.5.54 (seeds)</w:t>
+      </w:r>
+    </w:p>
+    <w:p>
+      <w:pPr>
+        <w:pStyle w:val="Entry"/>
+      </w:pPr>
+      <w:r>
+        <w:rPr>
+          <w:b/>
+        </w:rPr>
         <w:t>Alternation of generations</w:t>
       </w:r>
       <w:r>
@@ -4062,6 +4128,21 @@
         <w:rPr>
           <w:b/>
         </w:rPr>
+        <w:t>Archaeplastida</w:t>
+      </w:r>
+      <w:r>
+        <w:rPr/>
+        <w:t xml:space="preserve"> 23.1.4 (plant classification)</w:t>
+      </w:r>
+    </w:p>
+    <w:p>
+      <w:pPr>
+        <w:pStyle w:val="Entry"/>
+      </w:pPr>
+      <w:r>
+        <w:rPr>
+          <w:b/>
+        </w:rPr>
         <w:t>Archegonia</w:t>
       </w:r>
       <w:r>
@@ -4137,6 +4218,21 @@
         <w:rPr>
           <w:b/>
         </w:rPr>
+        <w:t>Carboniferous</w:t>
+      </w:r>
+      <w:r>
+        <w:rPr/>
+        <w:t xml:space="preserve"> see Devonian, Carboniferous</w:t>
+      </w:r>
+    </w:p>
+    <w:p>
+      <w:pPr>
+        <w:pStyle w:val="Entry"/>
+      </w:pPr>
+      <w:r>
+        <w:rPr>
+          <w:b/>
+        </w:rPr>
         <w:t>Carpel</w:t>
       </w:r>
       <w:r>
@@ -4186,7 +4282,7 @@
       </w:r>
       <w:r>
         <w:rPr/>
-        <w:t xml:space="preserve"> see Glossary</w:t>
+        <w:t xml:space="preserve"> 23.1.5 (charophytes, land plants)</w:t>
       </w:r>
     </w:p>
     <w:p>
@@ -4332,6 +4428,21 @@
         <w:rPr>
           <w:b/>
         </w:rPr>
+        <w:t>Cyanobacteria</w:t>
+      </w:r>
+      <w:r>
+        <w:rPr/>
+        <w:t xml:space="preserve"> 23.2.19 (hornwort partners)</w:t>
+      </w:r>
+    </w:p>
+    <w:p>
+      <w:pPr>
+        <w:pStyle w:val="Entry"/>
+      </w:pPr>
+      <w:r>
+        <w:rPr>
+          <w:b/>
+        </w:rPr>
         <w:t>Cycads</w:t>
       </w:r>
       <w:r>
@@ -4351,7 +4462,7 @@
       </w:r>
       <w:r>
         <w:rPr/>
-        <w:t xml:space="preserve"> see Glossary</w:t>
+        <w:t xml:space="preserve"> 23.1.11 (diploid hides it)</w:t>
       </w:r>
     </w:p>
     <w:p>
@@ -4366,7 +4477,37 @@
       </w:r>
       <w:r>
         <w:rPr/>
-        <w:t xml:space="preserve"> see Glossary</w:t>
+        <w:t xml:space="preserve"> 23.1.9 (cuticle)</w:t>
+      </w:r>
+    </w:p>
+    <w:p>
+      <w:pPr>
+        <w:pStyle w:val="Entry"/>
+      </w:pPr>
+      <w:r>
+        <w:rPr>
+          <w:b/>
+        </w:rPr>
+        <w:t>Devonian, Carboniferous</w:t>
+      </w:r>
+      <w:r>
+        <w:rPr/>
+        <w:t xml:space="preserve"> 23.4.36 (pteridophytes dominant)</w:t>
+      </w:r>
+    </w:p>
+    <w:p>
+      <w:pPr>
+        <w:pStyle w:val="Entry"/>
+      </w:pPr>
+      <w:r>
+        <w:rPr>
+          <w:b/>
+        </w:rPr>
+        <w:t>Dinosaurs</w:t>
+      </w:r>
+      <w:r>
+        <w:rPr/>
+        <w:t xml:space="preserve"> see Mesozoic era, dinosaurs</w:t>
       </w:r>
     </w:p>
     <w:p>
@@ -4392,6 +4533,21 @@
         <w:rPr>
           <w:b/>
         </w:rPr>
+        <w:t>Dispersal</w:t>
+      </w:r>
+      <w:r>
+        <w:rPr/>
+        <w:t xml:space="preserve"> 23.1.15 (spores vs seeds), 23.5.54 (seed plants), 23.5.90 (fruits)</w:t>
+      </w:r>
+    </w:p>
+    <w:p>
+      <w:pPr>
+        <w:pStyle w:val="Entry"/>
+      </w:pPr>
+      <w:r>
+        <w:rPr>
+          <w:b/>
+        </w:rPr>
         <w:t>Dominant generation</w:t>
       </w:r>
       <w:r>
@@ -4527,6 +4683,21 @@
         <w:rPr>
           <w:b/>
         </w:rPr>
+        <w:t>Eucalyptus</w:t>
+      </w:r>
+      <w:r>
+        <w:rPr/>
+        <w:t xml:space="preserve"> see Duckweed, Eucalyptus</w:t>
+      </w:r>
+    </w:p>
+    <w:p>
+      <w:pPr>
+        <w:pStyle w:val="Entry"/>
+      </w:pPr>
+      <w:r>
+        <w:rPr>
+          <w:b/>
+        </w:rPr>
         <w:t>Eudicots</w:t>
       </w:r>
       <w:r>
@@ -4546,7 +4717,7 @@
       </w:r>
       <w:r>
         <w:rPr/>
-        <w:t xml:space="preserve"> see Glossary</w:t>
+        <w:t xml:space="preserve"> 23.5.57 (gymnosperm groups)</w:t>
       </w:r>
     </w:p>
     <w:p>
@@ -4572,6 +4743,21 @@
         <w:rPr>
           <w:b/>
         </w:rPr>
+        <w:t>Fibrous root system</w:t>
+      </w:r>
+      <w:r>
+        <w:rPr/>
+        <w:t xml:space="preserve"> see Taproot / fibrous root system</w:t>
+      </w:r>
+    </w:p>
+    <w:p>
+      <w:pPr>
+        <w:pStyle w:val="Entry"/>
+      </w:pPr>
+      <w:r>
+        <w:rPr>
+          <w:b/>
+        </w:rPr>
         <w:t>Filament</w:t>
       </w:r>
       <w:r>
@@ -4591,7 +4777,7 @@
       </w:r>
       <w:r>
         <w:rPr/>
-        <w:t xml:space="preserve"> see Glossary</w:t>
+        <w:t xml:space="preserve"> 23.4.36 (megaphylls)</w:t>
       </w:r>
     </w:p>
     <w:p>
@@ -4621,7 +4807,7 @@
       </w:r>
       <w:r>
         <w:rPr/>
-        <w:t xml:space="preserve"> see Glossary</w:t>
+        <w:t xml:space="preserve"> 23.2.19 (hornworts)</w:t>
       </w:r>
     </w:p>
     <w:p>
@@ -4692,6 +4878,21 @@
         <w:rPr>
           <w:b/>
         </w:rPr>
+        <w:t>Gemma cup</w:t>
+      </w:r>
+      <w:r>
+        <w:rPr/>
+        <w:t xml:space="preserve"> 23.2.18 (Marchantia)</w:t>
+      </w:r>
+    </w:p>
+    <w:p>
+      <w:pPr>
+        <w:pStyle w:val="Entry"/>
+      </w:pPr>
+      <w:r>
+        <w:rPr>
+          <w:b/>
+        </w:rPr>
         <w:t>Gemmae</w:t>
       </w:r>
       <w:r>
@@ -4797,6 +4998,21 @@
         <w:rPr>
           <w:b/>
         </w:rPr>
+        <w:t>Ground pines</w:t>
+      </w:r>
+      <w:r>
+        <w:rPr/>
+        <w:t xml:space="preserve"> see Club mosses, ground pines (Lycopodium)</w:t>
+      </w:r>
+    </w:p>
+    <w:p>
+      <w:pPr>
+        <w:pStyle w:val="Entry"/>
+      </w:pPr>
+      <w:r>
+        <w:rPr>
+          <w:b/>
+        </w:rPr>
         <w:t>Gymnosperms</w:t>
       </w:r>
       <w:r>
@@ -4816,7 +5032,22 @@
       </w:r>
       <w:r>
         <w:rPr/>
-        <w:t xml:space="preserve"> see Glossary</w:t>
+        <w:t xml:space="preserve"> 23.5.81 (monocots vs eudicots)</w:t>
+      </w:r>
+    </w:p>
+    <w:p>
+      <w:pPr>
+        <w:pStyle w:val="Entry"/>
+      </w:pPr>
+      <w:r>
+        <w:rPr>
+          <w:b/>
+        </w:rPr>
+        <w:t>Heterosporous</w:t>
+      </w:r>
+      <w:r>
+        <w:rPr/>
+        <w:t xml:space="preserve"> see Homosporous / heterosporous</w:t>
       </w:r>
     </w:p>
     <w:p>
@@ -4872,6 +5103,36 @@
         <w:rPr>
           <w:b/>
         </w:rPr>
+        <w:t>Imperfect flower</w:t>
+      </w:r>
+      <w:r>
+        <w:rPr/>
+        <w:t xml:space="preserve"> see Perfect / imperfect flower</w:t>
+      </w:r>
+    </w:p>
+    <w:p>
+      <w:pPr>
+        <w:pStyle w:val="Entry"/>
+      </w:pPr>
+      <w:r>
+        <w:rPr>
+          <w:b/>
+        </w:rPr>
+        <w:t>Incomplete flower</w:t>
+      </w:r>
+      <w:r>
+        <w:rPr/>
+        <w:t xml:space="preserve"> see Complete / incomplete flower</w:t>
+      </w:r>
+    </w:p>
+    <w:p>
+      <w:pPr>
+        <w:pStyle w:val="Entry"/>
+      </w:pPr>
+      <w:r>
+        <w:rPr>
+          <w:b/>
+        </w:rPr>
         <w:t>Indusium</w:t>
       </w:r>
       <w:r>
@@ -4902,6 +5163,21 @@
         <w:rPr>
           <w:b/>
         </w:rPr>
+        <w:t>Juniper</w:t>
+      </w:r>
+      <w:r>
+        <w:rPr/>
+        <w:t xml:space="preserve"> see Spruce, juniper</w:t>
+      </w:r>
+    </w:p>
+    <w:p>
+      <w:pPr>
+        <w:pStyle w:val="Entry"/>
+      </w:pPr>
+      <w:r>
+        <w:rPr>
+          <w:b/>
+        </w:rPr>
         <w:t>Lignin</w:t>
       </w:r>
       <w:r>
@@ -5007,6 +5283,21 @@
         <w:rPr>
           <w:b/>
         </w:rPr>
+        <w:t>Mesozoic era, dinosaurs</w:t>
+      </w:r>
+      <w:r>
+        <w:rPr/>
+        <w:t xml:space="preserve"> 23.5.70 (cycads)</w:t>
+      </w:r>
+    </w:p>
+    <w:p>
+      <w:pPr>
+        <w:pStyle w:val="Entry"/>
+      </w:pPr>
+      <w:r>
+        <w:rPr>
+          <w:b/>
+        </w:rPr>
         <w:t>Microphylls</w:t>
       </w:r>
       <w:r>
@@ -5116,7 +5407,7 @@
       </w:r>
       <w:r>
         <w:rPr/>
-        <w:t xml:space="preserve"> see Glossary</w:t>
+        <w:t xml:space="preserve"> 23.2.19 (hornworts)</w:t>
       </w:r>
     </w:p>
     <w:p>
@@ -5247,6 +5538,21 @@
         <w:rPr>
           <w:b/>
         </w:rPr>
+        <w:t>Pine nuts, pine oil</w:t>
+      </w:r>
+      <w:r>
+        <w:rPr/>
+        <w:t xml:space="preserve"> 23.5.69 (uses)</w:t>
+      </w:r>
+    </w:p>
+    <w:p>
+      <w:pPr>
+        <w:pStyle w:val="Entry"/>
+      </w:pPr>
+      <w:r>
+        <w:rPr>
+          <w:b/>
+        </w:rPr>
         <w:t>Pines</w:t>
       </w:r>
       <w:r>
@@ -5671,7 +5977,7 @@
       </w:r>
       <w:r>
         <w:rPr/>
-        <w:t xml:space="preserve"> see Glossary</w:t>
+        <w:t xml:space="preserve"> 23.1.11 (less water loss)</w:t>
       </w:r>
     </w:p>
     <w:p>
@@ -5686,7 +5992,7 @@
       </w:r>
       <w:r>
         <w:rPr/>
-        <w:t xml:space="preserve"> see Glossary</w:t>
+        <w:t xml:space="preserve"> 23.5.81 (eudicots vs monocots)</w:t>
       </w:r>
     </w:p>
     <w:p>
@@ -5772,11 +6078,26 @@
         <w:rPr>
           <w:b/>
         </w:rPr>
-        <w:t>True roots, stems and leaves</w:t>
-      </w:r>
-      <w:r>
-        <w:rPr/>
-        <w:t xml:space="preserve"> see Glossary</w:t>
+        <w:t>Triassic fossil pollen</w:t>
+      </w:r>
+      <w:r>
+        <w:rPr/>
+        <w:t xml:space="preserve"> 23.5.78 (angiosperm origins)</w:t>
+      </w:r>
+    </w:p>
+    <w:p>
+      <w:pPr>
+        <w:pStyle w:val="Entry"/>
+      </w:pPr>
+      <w:r>
+        <w:rPr>
+          <w:b/>
+        </w:rPr>
+        <w:t>True roots (and stems, leaves)</w:t>
+      </w:r>
+      <w:r>
+        <w:rPr/>
+        <w:t xml:space="preserve"> 23.2.16 (bryophytes lack them)</w:t>
       </w:r>
     </w:p>
     <w:p>
@@ -5821,7 +6142,7 @@
       </w:r>
       <w:r>
         <w:rPr/>
-        <w:t xml:space="preserve"> see Glossary</w:t>
+        <w:t xml:space="preserve"> 23.5.81 (ring vs scattered)</w:t>
       </w:r>
     </w:p>
     <w:p>
@@ -5851,7 +6172,7 @@
       </w:r>
       <w:r>
         <w:rPr/>
-        <w:t xml:space="preserve"> see Glossary</w:t>
+        <w:t xml:space="preserve"> 23.5.81 (parallel vs net)</w:t>
       </w:r>
     </w:p>
     <w:p>
@@ -5896,7 +6217,22 @@
       </w:r>
       <w:r>
         <w:rPr/>
-        <w:t xml:space="preserve"> see Glossary</w:t>
+        <w:t xml:space="preserve"> 23.4.38 (horsetails)</w:t>
+      </w:r>
+    </w:p>
+    <w:p>
+      <w:pPr>
+        <w:pStyle w:val="Entry"/>
+      </w:pPr>
+      <w:r>
+        <w:rPr>
+          <w:b/>
+        </w:rPr>
+        <w:t>Woody</w:t>
+      </w:r>
+      <w:r>
+        <w:rPr/>
+        <w:t xml:space="preserve"> see Herbaceous / woody</w:t>
       </w:r>
     </w:p>
     <w:p>

</xml_diff>